<commit_message>
Docs: record M3 decisions (OpenAI embeddings, Qdrant) in 03 §12 and 14 §12; add folder_permissions to 04 (v2.2)
Closes the embeddings-provider and vector-store open decisions the code took
at M3, and documents the folder_permissions table added in Epic F, so the
schema doc again matches the migrations.

Co-Authored-By: Claude Fable 5.1 <noreply@anthropic.com>
Claude-Session: https://claude.ai/code/session_01RD5kD4obV2Jan7tMKpiqPQ
</commit_message>
<xml_diff>
--- a/Documentation/03-Technical-Architecture.docx
+++ b/Documentation/03-Technical-Architecture.docx
@@ -65,7 +65,7 @@
           <w:sz w:val="20"/>
           <w:szCs w:val="20"/>
         </w:rPr>
-        <w:t>Version 2.0  ·  Project documentation  ·  2026</w:t>
+        <w:t>Version 2.1  ·  Project documentation  ·  2026</w:t>
       </w:r>
     </w:p>
     <w:p>
@@ -602,7 +602,7 @@
                 <w:sz w:val="20"/>
                 <w:szCs w:val="20"/>
               </w:rPr>
-              <w:t xml:space="preserve">Voyage AI, OpenAI </w:t>
+              <w:t>Decided (M3): OpenAI text-embedding-3-small, 1536 dims, behind the Embeddings driver; embed_model recorded per chunk</w:t>
             </w:r>
             <w:r>
               <w:rPr>
@@ -612,16 +612,14 @@
                 <w:szCs w:val="18"/>
                 <w:shd w:fill="F4F5F7" w:val="clear"/>
               </w:rPr>
-              <w:t xml:space="preserve">text-embedding-3</w:t>
-            </w:r>
-            <w:r>
-              <w:rPr>
-                <w:rFonts w:ascii="Calibri" w:cs="Calibri" w:eastAsia="Calibri" w:hAnsi="Calibri"/>
-                <w:color w:val="1A1A1A"/>
-                <w:sz w:val="20"/>
-                <w:szCs w:val="20"/>
-              </w:rPr>
-              <w:t xml:space="preserve">, self-hosted</w:t>
+            </w:r>
+            <w:r>
+              <w:rPr>
+                <w:rFonts w:ascii="Calibri" w:cs="Calibri" w:eastAsia="Calibri" w:hAnsi="Calibri"/>
+                <w:color w:val="1A1A1A"/>
+                <w:sz w:val="20"/>
+                <w:szCs w:val="20"/>
+              </w:rPr>
             </w:r>
           </w:p>
         </w:tc>
@@ -740,7 +738,7 @@
                 <w:sz w:val="20"/>
                 <w:szCs w:val="20"/>
               </w:rPr>
-              <w:t xml:space="preserve">Qdrant on a DigitalOcean droplet, or managed Pinecone</w:t>
+              <w:t>Decided (M3): Qdrant self-hosted on a DigitalOcean droplet, behind the VectorStore driver; every point carries workspace_id and every search filters on it</w:t>
             </w:r>
           </w:p>
         </w:tc>
@@ -6026,7 +6024,7 @@
                 <w:sz w:val="20"/>
                 <w:szCs w:val="20"/>
               </w:rPr>
-              <w:t xml:space="preserve">Embeddings driver (TBD)</w:t>
+              <w:t>Embeddings driver (OpenAI text-embedding-3-small)</w:t>
             </w:r>
           </w:p>
         </w:tc>
@@ -10011,7 +10009,7 @@
                 <w:sz w:val="20"/>
                 <w:szCs w:val="20"/>
               </w:rPr>
-              <w:t xml:space="preserve">Voyage AI for retrieval quality, OpenAI </w:t>
+              <w:t>Decided: OpenAI text-embedding-3-small (cost; one fewer vendor). Driver interface keeps Voyage AI as a later swap</w:t>
             </w:r>
             <w:r>
               <w:rPr>
@@ -10021,16 +10019,14 @@
                 <w:szCs w:val="18"/>
                 <w:shd w:fill="F4F5F7" w:val="clear"/>
               </w:rPr>
-              <w:t xml:space="preserve">text-embedding-3-small</w:t>
-            </w:r>
-            <w:r>
-              <w:rPr>
-                <w:rFonts w:ascii="Calibri" w:cs="Calibri" w:eastAsia="Calibri" w:hAnsi="Calibri"/>
-                <w:color w:val="1A1A1A"/>
-                <w:sz w:val="20"/>
-                <w:szCs w:val="20"/>
-              </w:rPr>
-              <w:t xml:space="preserve"> for cost</w:t>
+            </w:r>
+            <w:r>
+              <w:rPr>
+                <w:rFonts w:ascii="Calibri" w:cs="Calibri" w:eastAsia="Calibri" w:hAnsi="Calibri"/>
+                <w:color w:val="1A1A1A"/>
+                <w:sz w:val="20"/>
+                <w:szCs w:val="20"/>
+              </w:rPr>
             </w:r>
           </w:p>
         </w:tc>
@@ -10160,7 +10156,7 @@
                 <w:sz w:val="20"/>
                 <w:szCs w:val="20"/>
               </w:rPr>
-              <w:t xml:space="preserve">Qdrant on a DO droplet keeps one provider and one bill; Pinecone is faster to ship</w:t>
+              <w:t>Decided: Qdrant on a DO droplet — one provider, one bill. Collection created by `php artisan vector:ensure-collection` in the pre-deploy job</w:t>
             </w:r>
           </w:p>
         </w:tc>
@@ -10730,7 +10726,7 @@
           <w:sz w:val="20"/>
           <w:szCs w:val="20"/>
         </w:rPr>
-        <w:t xml:space="preserve">Decisions 1 to 3 were implicit in v1.0's stack and are now genuinely open. None can be deferred past the milestone listed.</w:t>
+        <w:t>Decisions 1 to 3 were implicit in v1.0's stack. Decisions 2 and 3 were taken at M3 (see below); decision 1 stays open until the M1 evaluation.</w:t>
       </w:r>
     </w:p>
     <w:sectPr>

</xml_diff>